<commit_message>
Add naive benchmark analysis scripts and output files
- Implemented `run_naive_benchmark.py` to calculate benchmark costs based on vessel data.
- Created CSV output for benchmark results by vessel and leg.
- Added summary JSON file for benchmark analysis with detailed metrics.
- Included metadata generation for the benchmark analysis.
</commit_message>
<xml_diff>
--- a/005 report/rapport.docx
+++ b/005 report/rapport.docx
@@ -2,7 +2,7 @@
 <file path=word/document.xml><?xml version="1.0" encoding="utf-8"?>
 <w:document xmlns:w="http://schemas.openxmlformats.org/wordprocessingml/2006/main" xmlns:m="http://schemas.openxmlformats.org/officeDocument/2006/math" xmlns:r="http://schemas.openxmlformats.org/officeDocument/2006/relationships" xmlns:o="urn:schemas-microsoft-com:office:office" xmlns:v="urn:schemas-microsoft-com:vml" xmlns:w10="urn:schemas-microsoft-com:office:word" xmlns:a="http://schemas.openxmlformats.org/drawingml/2006/main" xmlns:pic="http://schemas.openxmlformats.org/drawingml/2006/picture" xmlns:wp="http://schemas.openxmlformats.org/drawingml/2006/wordprocessingDrawing">
   <w:body>
-    <w:bookmarkStart w:id="79" w:name="g21---sespamalstreken-chablis"/>
+    <w:bookmarkStart w:id="80" w:name="g21---sespamalstreken-chablis"/>
     <w:p>
       <w:pPr>
         <w:pStyle w:val="Heading1"/>
@@ -466,7 +466,7 @@
         <w:pStyle w:val="FirstParagraph"/>
       </w:pPr>
       <w:r>
-        <w:t xml:space="preserve">Dersom prosjektet faller inn under Helseforskningsloven, skal det også søkes om forhåndsgodkjenning fra Regionale komiteer for medisinsk og helsefaglig forsikningsetikk, REK, i din region.</w:t>
+        <w:t xml:space="preserve">Dersom prosjektet faller inn under Helseforskningsloven, skal det også søkes om forhåndsgodkjenning fra Regionale komiteer for medisinsk og helsefaglig forskningsetikk, REK, i din region.</w:t>
       </w:r>
     </w:p>
     <w:p>
@@ -560,6 +560,12 @@
         </w:rPr>
         <w:t xml:space="preserve">Studiepoeng:</w:t>
       </w:r>
+      <w:r>
+        <w:t xml:space="preserve"> </w:t>
+      </w:r>
+      <w:r>
+        <w:t xml:space="preserve">15</w:t>
+      </w:r>
     </w:p>
     <w:p>
       <w:pPr>
@@ -571,6 +577,12 @@
           <w:bCs/>
         </w:rPr>
         <w:t xml:space="preserve">Veileder:</w:t>
+      </w:r>
+      <w:r>
+        <w:t xml:space="preserve"> </w:t>
+      </w:r>
+      <w:r>
+        <w:t xml:space="preserve">Bård Inge Pettersen og Per Kristian Rekdal</w:t>
       </w:r>
     </w:p>
     <w:bookmarkStart w:id="13" w:name="X5200c7fed0661119b98abb3f4ad3246238f16d4"/>
@@ -711,6 +723,12 @@
         </w:rPr>
         <w:t xml:space="preserve">Dato:</w:t>
       </w:r>
+      <w:r>
+        <w:t xml:space="preserve"> </w:t>
+      </w:r>
+      <w:r>
+        <w:t xml:space="preserve">31.05.2026</w:t>
+      </w:r>
     </w:p>
     <w:p>
       <w:pPr>
@@ -727,7 +745,7 @@
         <w:t xml:space="preserve"> </w:t>
       </w:r>
       <w:r>
-        <w:t xml:space="preserve">Marker denne setningen, og skriv inn antall ord dersom det er et krav at antall ord skal oppgis. Hvis det ikke er et krav at antall ord skal oppgis slettes hele dette avsnittet, og i begge tilfeller slettes denne setning.</w:t>
+        <w:t xml:space="preserve">ca. 11 974</w:t>
       </w:r>
     </w:p>
     <w:p>
@@ -745,7 +763,7 @@
         <w:t xml:space="preserve"> </w:t>
       </w:r>
       <w:r>
-        <w:t xml:space="preserve">Marker denne setningen, og skriv inn forfattererklæring dersom det er et krav til oppgaven. Hvis det ikke er krav om forfattererklæring slettes hele dette avsnitt, og i begge tilfeller slettes denne setning.</w:t>
+        <w:t xml:space="preserve">Elisabeth Kirkeland Orlien og Kaylee Floden</w:t>
       </w:r>
     </w:p>
     <w:p>
@@ -771,15 +789,15 @@
         <w:pStyle w:val="FirstParagraph"/>
       </w:pPr>
       <w:r>
-        <w:t xml:space="preserve">Denne rapporten undersøker hvordan en lineær optimaliseringsmodell kan brukes som beslutningsstøtte for å minimere drivstoffkostnader hos Odfjell Tankers. Analysen bygger på historiske bunkringsdata for LSF i fire prisede modellhavner, kombinert med operative voyage-, forbruks- og beholdningsdata. Datagrunnlaget brukes først til å beskrive historisk pris- og volumutvikling, og deretter til å formulere en kostnadsminimerende bunkringsmodell med restriksjoner for rutesekvens, tankkapasitet og ikke-negativ beholdning.</w:t>
-      </w:r>
-    </w:p>
-    <w:p>
-      <w:pPr>
-        <w:pStyle w:val="BodyText"/>
-      </w:pPr>
-      <w:r>
-        <w:t xml:space="preserve">Hovedmodellen behandler 486 voyage-etapper for åtte anonymiserte fartøyfiler. I basisscenarioet kjøper modellen 18 857,45 enheter i prisede modellhavner og fører 21 260,62 enheter som ekstern/ukjent bunkring. Ekstern/ukjent bunkring betyr her drivstoffbehov som ikke kan dekkes gjennom de prisede modellhavnene i rapportens datagrunnlag, og som derfor kostnadssettes med en proxypris. Dette tilsvarer at 41,59 % av modellert forbruk dekkes gjennom prisede modellhavner, mens 46,89 % faller utenfor dagens prisgrunnlag. Total modellkostnad i basisscenarioet er 26 625 664,78. Sensitivitetsanalysen viser at total modellkostnad varierer med 5 190 071,68 når proxykostnaden for ekstern/ukjent bunkring endres fra faktor 1,10 til 1,50, men kjøpsplanen er stabil i de testede scenarioene.</w:t>
+        <w:t xml:space="preserve">Denne rapporten undersøker i hvilken grad en deterministisk lineær kostnadsmodell kan gi etterprøvbar beslutningsstøtte for bunkring hos Odfjell Tankers. Analysen bygger på historiske bunkringsdata for LSF i fire prisede modellhavner, kombinert med operative voyage-, forbruks- og beholdningsdata for åtte anonymiserte fartøyfiler. Datagrunnlaget brukes først til å beskrive historisk pris- og volumutvikling, og deretter til å formulere en kostnadsminimerende bunkringsmodell med restriksjoner for rutesekvens, tankkapasitet og ikke-negativ beholdning.</w:t>
+      </w:r>
+    </w:p>
+    <w:p>
+      <w:pPr>
+        <w:pStyle w:val="BodyText"/>
+      </w:pPr>
+      <w:r>
+        <w:t xml:space="preserve">Hovedmodellen behandler 486 voyage-etapper for åtte anonymiserte fartøyfiler. I basisscenarioet kjøper modellen 18 857,45 enheter i prisede modellhavner og fører 21 260,62 enheter som ekstern/ukjent bunkring. Ekstern/ukjent bunkring betyr her drivstoffbehov som ikke kan dekkes gjennom de prisede modellhavnene i rapportens datagrunnlag, og som derfor kostnadssettes med en proxypris. Dette tilsvarer at 41,59 % av modellert forbruk dekkes gjennom prisede modellhavner, mens 46,89 % faller utenfor dagens prisgrunnlag. Total modellkostnad i basisscenarioet er 26 625 664,78. En enkel naiv benchmark gir 28 926 322,77 i modellkostnad, slik at LP-modellen ligger 2 300 657,99 lavere enn denne referanseregelen innenfor samme datagrunnlag. Dette er ikke dokumentert besparelse mot faktisk Odfjell-praksis. Sensitivitetsanalysen viser at total modellkostnad varierer med 5 190 071,68 når proxykostnaden for ekstern/ukjent bunkring endres fra faktor 1,10 til 1,50, men kjøpsplanen er stabil i de testede scenarioene.</w:t>
       </w:r>
     </w:p>
     <w:p>
@@ -812,15 +830,15 @@
         <w:pStyle w:val="FirstParagraph"/>
       </w:pPr>
       <w:r>
-        <w:t xml:space="preserve">This report examines how a linear optimization model can support fuel cost minimization for Odfjell Tankers. The analysis is based on historical LSF bunkering data from four priced model ports, combined with operational voyage, consumption and inventory data. The data are first used to describe historical price and volume patterns, and then to formulate a cost-minimizing bunkering model with constraints for route sequence, tank capacity and non-negative inventory.</w:t>
-      </w:r>
-    </w:p>
-    <w:p>
-      <w:pPr>
-        <w:pStyle w:val="BodyText"/>
-      </w:pPr>
-      <w:r>
-        <w:t xml:space="preserve">The main model covers 486 voyage legs across eight anonymized vessel files. In the baseline scenario, the model purchases 18,857.45 units in priced model ports and assigns 21,260.62 units to external/unknown bunkering. External/unknown bunkering means fuel demand that cannot be covered through the priced model ports in the report’s data basis and is therefore priced with a proxy cost. This means that 41.59% of modeled consumption is covered through priced model ports, while 46.89% falls outside the current price coverage. The total model cost in the baseline scenario is 26,625,664.78. The sensitivity analysis shows that total model cost varies by 5,190,071.68 when the proxy cost for external/unknown bunkering changes from factor 1.10 to 1.50, while the purchase plan remains stable in the tested scenarios.</w:t>
+        <w:t xml:space="preserve">This report examines to what extent a deterministic linear cost model can provide verifiable bunkering decision support for Odfjell Tankers. The analysis is based on historical LSF bunkering data from four priced model ports, combined with operational voyage, consumption and inventory data for eight anonymized vessel files. The data are first used to describe historical price and volume patterns, and then to formulate a cost-minimizing bunkering model with constraints for route sequence, tank capacity and non-negative inventory.</w:t>
+      </w:r>
+    </w:p>
+    <w:p>
+      <w:pPr>
+        <w:pStyle w:val="BodyText"/>
+      </w:pPr>
+      <w:r>
+        <w:t xml:space="preserve">The main model covers 486 voyage legs across eight anonymized vessel files. In the baseline scenario, the model purchases 18,857.45 units in priced model ports and assigns 21,260.62 units to external/unknown bunkering. External/unknown bunkering means fuel demand that cannot be covered through the priced model ports in the report’s data basis and is therefore priced with a proxy cost. This means that 41.59% of modeled consumption is covered through priced model ports, while 46.89% falls outside the current price coverage. The total model cost in the baseline scenario is 26,625,664.78. A simple naive benchmark gives a model cost of 28,926,322.77, so the LP model is 2,300,657.99 lower than this reference rule within the same data basis. This is not documented savings against actual Odfjell practice. The sensitivity analysis shows that total model cost varies by 5,190,071.68 when the proxy cost for external/unknown bunkering changes from factor 1.10 to 1.50, while the purchase plan remains stable in the tested scenarios.</w:t>
       </w:r>
     </w:p>
     <w:p>
@@ -1241,7 +1259,7 @@
         </w:numPr>
       </w:pPr>
       <w:r>
-        <w:t xml:space="preserve">8.5 Sensitivitet for ekstern proxypris</w:t>
+        <w:t xml:space="preserve">8.5 Naiv benchmark</w:t>
       </w:r>
     </w:p>
     <w:p>
@@ -1253,7 +1271,7 @@
         </w:numPr>
       </w:pPr>
       <w:r>
-        <w:t xml:space="preserve">9.0 Diskusjon</w:t>
+        <w:t xml:space="preserve">8.6 Sensitivitet for ekstern proxypris</w:t>
       </w:r>
     </w:p>
     <w:p>
@@ -1265,7 +1283,7 @@
         </w:numPr>
       </w:pPr>
       <w:r>
-        <w:t xml:space="preserve">9.1 Praktiske og faglige implikasjoner</w:t>
+        <w:t xml:space="preserve">9.0 Diskusjon</w:t>
       </w:r>
     </w:p>
     <w:p>
@@ -1277,7 +1295,7 @@
         </w:numPr>
       </w:pPr>
       <w:r>
-        <w:t xml:space="preserve">9.2 Begrensninger og videre bruk</w:t>
+        <w:t xml:space="preserve">9.1 Praktiske og faglige implikasjoner</w:t>
       </w:r>
     </w:p>
     <w:p>
@@ -1289,7 +1307,7 @@
         </w:numPr>
       </w:pPr>
       <w:r>
-        <w:t xml:space="preserve">10.0 Konklusjon</w:t>
+        <w:t xml:space="preserve">9.2 Begrensninger og videre bruk</w:t>
       </w:r>
     </w:p>
     <w:p>
@@ -1301,7 +1319,7 @@
         </w:numPr>
       </w:pPr>
       <w:r>
-        <w:t xml:space="preserve">11.0 Bibliografi</w:t>
+        <w:t xml:space="preserve">10.0 Konklusjon</w:t>
       </w:r>
     </w:p>
     <w:p>
@@ -1313,6 +1331,18 @@
         </w:numPr>
       </w:pPr>
       <w:r>
+        <w:t xml:space="preserve">11.0 Bibliografi</w:t>
+      </w:r>
+    </w:p>
+    <w:p>
+      <w:pPr>
+        <w:pStyle w:val="Compact"/>
+        <w:numPr>
+          <w:ilvl w:val="0"/>
+          <w:numId w:val="1004"/>
+        </w:numPr>
+      </w:pPr>
+      <w:r>
         <w:t xml:space="preserve">12.0 Vedlegg</w:t>
       </w:r>
     </w:p>
@@ -1346,7 +1376,17 @@
         <w:pStyle w:val="BodyText"/>
       </w:pPr>
       <w:r>
-        <w:t xml:space="preserve">Beslutningene tas samtidig i en operativ virkelighet preget av prisvariasjon mellom havner, ulike innkjøpsformer og behov for å balansere kostnad, tilgjengelighet, kvalitet og regulatoriske rammer (FuelEU Guidance Document for Shipping Companies, 2025). Dette gjør bunkringsbeslutninger til et relevant område for beslutningsstøtte basert på data og optimering. Temaet er aktuelt fordi historiske transaksjonsdata gir mulighet til å undersøke om det finnes systematiske mønstre i pris og volum som kan utnyttes bedre enn i en mer erfaringsbasert beslutningsprosess. Dersom slike mønstre kan dokumenteres og knyttes til en enkel og transparent modell, kan analysen gi Odfjell Tankers et bedre grunnlag for å vurdere hvor bunkring bør skje under gitte forutsetninger.</w:t>
+        <w:t xml:space="preserve">Beslutningene tas samtidig i en operativ virkelighet preget av prisvariasjon mellom havner, ulike innkjøpsformer og behov for å balansere kostnad, tilgjengelighet, kvalitet og regulatoriske rammer (</w:t>
+      </w:r>
+      <w:r>
+        <w:rPr>
+          <w:i/>
+          <w:iCs/>
+        </w:rPr>
+        <w:t xml:space="preserve">FuelEU Guidance Document for Shipping Companies</w:t>
+      </w:r>
+      <w:r>
+        <w:t xml:space="preserve">, 2025, se Vedlegg B). Dette gjør bunkringsbeslutninger til et relevant område for beslutningsstøtte basert på data og optimering. Temaet er aktuelt fordi historiske transaksjonsdata gir mulighet til å undersøke om det finnes systematiske mønstre i pris og volum som kan utnyttes bedre enn i en mer erfaringsbasert beslutningsprosess. Dersom slike mønstre kan dokumenteres og knyttes til en enkel og transparent modell, kan analysen gi Odfjell Tankers et bedre grunnlag for å vurdere hvor bunkring bør skje under gitte forutsetninger.</w:t>
       </w:r>
     </w:p>
     <w:p>
@@ -1387,7 +1427,7 @@
         <w:pStyle w:val="FirstParagraph"/>
       </w:pPr>
       <w:r>
-        <w:t xml:space="preserve">Hvordan kan en lineær optimaliseringsmodell bidra til å minimere drivstoffkostnader for Odfjell Tankers ved bruk av historiske prisdata og operative voyage-, forbruks- og beholdningsdata?</w:t>
+        <w:t xml:space="preserve">I hvilken grad kan en deterministisk lineær kostnadsmodell, avgrenset til fire prisede modellhavner, én drivstoffkategori og åtte anonymiserte fartøyfiler, gi etterprøvbar beslutningsstøtte for fordeling av bunkring i Odfjell Tankers’ rutestruktur?</w:t>
       </w:r>
     </w:p>
     <w:p>
@@ -1720,15 +1760,27 @@
         <w:pStyle w:val="BodyText"/>
       </w:pPr>
       <w:r>
-        <w:t xml:space="preserve">Denne litteraturen har to konsekvenser for rapporten. For det første støtter den at bunkringsbeslutninger kan analyseres som et optimeringsproblem med pris, kapasitet, rute og forbruk som sentrale parametere. For det andre viser den at mer avanserte modeller ofte inkluderer usikkerhet, hastighet, rutevalg, kontrakter og flere drivstofftyper. Rapportens modell er enklere: rutesekvensen tas som gitt, prisgrunnlaget er avgrenset til fire modellhavner, og ekstern/ukjent bunkring brukes for å synliggjøre datagap.</w:t>
-      </w:r>
-    </w:p>
-    <w:p>
-      <w:pPr>
-        <w:pStyle w:val="BodyText"/>
-      </w:pPr>
-      <w:r>
-        <w:t xml:space="preserve">Det faglige hullet rapporten adresserer er derfor ikke mangel på optimeringsmodeller for bunkring generelt. Hullet ligger i den praktiske overgangen fra et begrenset historisk transaksjonsdatasett til en transparent og etterprøvbar beslutningsstøttemodell for et konkret redericase. Rapportens bidrag er å vise hvordan historiske prisdata, voyage-data, forbruk, beholdning og kapasitet kan kobles i en lineær rute- og lagerbasert modell, samtidig som modellen klassifiserer hvor resultatene er direkte anvendbare og hvor datadekningen fortsatt er for svak.</w:t>
+        <w:t xml:space="preserve">Denne litteraturen har to konsekvenser for rapporten. For det første støtter den at bunkringsbeslutninger kan analyseres som et optimeringsproblem med pris, kapasitet, rute og forbruk som sentrale parametere. For det andre viser den at mer avanserte modeller ofte inkluderer usikkerhet, hastighet, rutevalg, kontrakter og flere drivstofftyper. Rapportens modell er enklere: rutesekvensen tas som gitt, prisgrunnlaget er avgrenset til fire modellhavner, og ekstern/ukjent bunkring brukes for å synliggjøre datagap. Dette er et bevisst metodevalg. En deterministisk LP-modell er valgt fremfor stokastisk eller robust optimering fordi datagrunnlaget i denne rapporten ikke inneholder uavhengige sannsynlighetsfordelinger for framtidige havnepriser, forbruk eller operativ tilgjengelighet. Målet er derfor ikke å modellere usikkerhet fullt ut, men å undersøke hva som kan optimeres transparent med de observerte dataene som faktisk foreligger.</w:t>
+      </w:r>
+    </w:p>
+    <w:p>
+      <w:pPr>
+        <w:pStyle w:val="BodyText"/>
+      </w:pPr>
+      <w:r>
+        <w:t xml:space="preserve">Det faglige hullet rapporten adresserer er derfor ikke mangel på optimeringsmodeller for bunkring generelt. Hullet ligger i den praktiske overgangen fra et begrenset historisk transaksjonsdatasett til en transparent og etterprøvbar beslutningsstøttemodell for et konkret redericase. Rapportens bidrag er å vise hvordan historiske prisdata, voyage-data, forbruk, beholdning og kapasitet kan kobles i en lineær rute- og lagerbasert modell, samtidig som modellen klassifiserer hvor resultatene er direkte anvendbare og hvor datadekningen fortsatt er for svak. Siden modellen balanserer kjøp, beholdning og kapasitet langs en gitt rute, har den også en tydelig kobling til refueling- og lagerlogikk, selv om rapporten ikke estimerer en klassisk</w:t>
+      </w:r>
+      <w:r>
+        <w:t xml:space="preserve"> </w:t>
+      </w:r>
+      <w:r>
+        <w:rPr>
+          <w:rStyle w:val="VerbatimChar"/>
+        </w:rPr>
+        <w:t xml:space="preserve">(s, S)</w:t>
+      </w:r>
+      <w:r>
+        <w:t xml:space="preserve">-politikk.</w:t>
       </w:r>
     </w:p>
     <w:p>
@@ -1981,7 +2033,7 @@
         <w:t xml:space="preserve">Everything You Need to Know About Marine Fuels</w:t>
       </w:r>
       <w:r>
-        <w:t xml:space="preserve">, u.å.). I denne rapporten fungerer</w:t>
+        <w:t xml:space="preserve">, u.å., se Vedlegg A). I denne rapporten fungerer</w:t>
       </w:r>
       <w:r>
         <w:t xml:space="preserve"> </w:t>
@@ -2056,7 +2108,7 @@
         <w:t xml:space="preserve">FuelEU Guidance Document for Shipping Companies</w:t>
       </w:r>
       <w:r>
-        <w:t xml:space="preserve">, 2025). Drivstoffvalget påvirkes dermed i praksis både av pris, tilgjengelighet, kvalitet og regulatoriske rammer. Den faktiske beslutningssituasjonen er derfor mer sammensatt enn den avgrensede analysen i denne rapporten.</w:t>
+        <w:t xml:space="preserve">, 2025, se Vedlegg B). Drivstoffvalget påvirkes dermed i praksis både av pris, tilgjengelighet, kvalitet og regulatoriske rammer. Den faktiske beslutningssituasjonen er derfor mer sammensatt enn den avgrensede analysen i denne rapporten.</w:t>
       </w:r>
     </w:p>
     <w:p>
@@ -3326,7 +3378,7 @@
         <w:pStyle w:val="BodyText"/>
       </w:pPr>
       <w:r>
-        <w:t xml:space="preserve">Validitet, reliabilitet og etikk er vurdert som del av metodeopplegget. Intern validitet styrkes ved at modellen bygger direkte på observerte voyage-data, dokumenterte rensevalg og eksplisitte konsistenssjekker, men ekstern validitet er begrenset fordi modellen bare dekker én drivstoffkategori, fire prisede modellhavner og åtte anonymiserte fartøyfiler. Reliabiliteten styrkes gjennom reproduserbare skript, faste inputregler og sensitivitetsanalyse av proxykostnaden, men resultatene vil fortsatt være følsomme for endringer i prisdekning, rutegrunnlag og antagelser om ekstern/ukjent bunkring. Etisk er databehandlingen avgrenset til operasjonelle bedriftsdata uten personanalyse. Havner, fartøy og voyage-numre er pseudonymisert for å redusere risikoen for å eksponere kommersielt eller operasjonelt sensitiv informasjon. Siden prosjektet ikke behandler personopplysninger som forskningsdata, vurderes personvernet som lite berørt, men konfidensialitet rundt bedriftsdata er likevel et viktig hensyn.</w:t>
+        <w:t xml:space="preserve">Validitet, reliabilitet og etikk er vurdert som del av metodeopplegget. Intern validitet styrkes ved at modellen bygger direkte på observerte voyage-data, dokumenterte rensevalg og eksplisitte konsistenssjekker. Samtidig er det en viktig intern usikkerhet at prosjektgruppen ikke har mottatt en uavhengig datakvalitetsrapport for pris- og volumdatasettet, slik at eventuelle registreringsfeil hos dataleverandøren kan bli videreført. Ekstern validitet er begrenset fordi modellen bare dekker én drivstoffkategori, fire prisede modellhavner og åtte anonymiserte fartøyfiler. Resultatene kan derfor ikke uten videre generaliseres til hele Odfjells flåte, alle drivstofftyper eller havner utenfor prisgrunnlaget. Reliabiliteten styrkes gjennom reproduserbare skript, faste inputregler og sensitivitetsanalyse av proxykostnaden, men resultatene vil fortsatt være følsomme for endringer i prisdekning, rutegrunnlag og antagelser om ekstern/ukjent bunkring. Etisk er databehandlingen avgrenset til operasjonelle bedriftsdata uten personanalyse. Havner, fartøy og voyage-numre er pseudonymisert for å redusere risikoen for å eksponere kommersielt eller operasjonelt sensitiv informasjon. Siden prosjektet ikke behandler personopplysninger som forskningsdata, vurderes personvernet som lite berørt, men konfidensialitet rundt bedriftsdata er likevel et viktig hensyn.</w:t>
       </w:r>
     </w:p>
     <w:bookmarkEnd w:id="43"/>
@@ -4254,326 +4306,7 @@
         <w:t xml:space="preserve"> </w:t>
       </w:r>
       <w:r>
-        <w:t xml:space="preserve">fremstår som den dyreste havnen. Dette indikerer at havnevalg har potensial til å påvirke totale drivstoffkostnader og støtter relevansen av å utvikle en optimeringsmodell basert på datasettet.</w:t>
-      </w:r>
-    </w:p>
-    <w:p>
-      <w:pPr>
-        <w:pStyle w:val="BodyText"/>
-      </w:pPr>
-      <w:r>
-        <w:t xml:space="preserve">Tabell 5.4 oppsummerer den strukturerte havneinformasjonen som videreføres til modellgrunnlaget.</w:t>
-      </w:r>
-    </w:p>
-    <w:tbl>
-      <w:tblPr>
-        <w:tblStyle w:val="Table"/>
-        <w:tblW w:type="pct" w:w="5000"/>
-        <w:tblLayout w:type="fixed"/>
-        <w:tblLook w:firstRow="1" w:lastRow="0" w:firstColumn="0" w:lastColumn="0" w:noHBand="0" w:noVBand="0" w:val="0020"/>
-      </w:tblPr>
-      <w:tblGrid>
-        <w:gridCol w:w="1584"/>
-        <w:gridCol w:w="1584"/>
-        <w:gridCol w:w="1584"/>
-        <w:gridCol w:w="1584"/>
-        <w:gridCol w:w="1584"/>
-      </w:tblGrid>
-      <w:tr>
-        <w:trPr>
-          <w:tblHeader w:val="on"/>
-        </w:trPr>
-        <w:tc>
-          <w:tcPr/>
-          <w:p>
-            <w:pPr>
-              <w:pStyle w:val="Compact"/>
-            </w:pPr>
-            <w:r>
-              <w:t xml:space="preserve">Havn</w:t>
-            </w:r>
-          </w:p>
-        </w:tc>
-        <w:tc>
-          <w:tcPr/>
-          <w:p>
-            <w:pPr>
-              <w:pStyle w:val="Compact"/>
-            </w:pPr>
-            <w:r>
-              <w:t xml:space="preserve">Antall observasjoner</w:t>
-            </w:r>
-          </w:p>
-        </w:tc>
-        <w:tc>
-          <w:tcPr/>
-          <w:p>
-            <w:pPr>
-              <w:pStyle w:val="Compact"/>
-            </w:pPr>
-            <w:r>
-              <w:t xml:space="preserve">Total mengde</w:t>
-            </w:r>
-          </w:p>
-        </w:tc>
-        <w:tc>
-          <w:tcPr/>
-          <w:p>
-            <w:pPr>
-              <w:pStyle w:val="Compact"/>
-            </w:pPr>
-            <w:r>
-              <w:t xml:space="preserve">Vektet gjennomsnittspris</w:t>
-            </w:r>
-          </w:p>
-        </w:tc>
-        <w:tc>
-          <w:tcPr/>
-          <w:p>
-            <w:pPr>
-              <w:pStyle w:val="Compact"/>
-            </w:pPr>
-            <w:r>
-              <w:t xml:space="preserve">Antall måneder med observasjon</w:t>
-            </w:r>
-          </w:p>
-        </w:tc>
-      </w:tr>
-      <w:tr>
-        <w:tc>
-          <w:tcPr/>
-          <w:p>
-            <w:pPr>
-              <w:pStyle w:val="Compact"/>
-            </w:pPr>
-            <w:r>
-              <w:t xml:space="preserve">P001</w:t>
-            </w:r>
-          </w:p>
-        </w:tc>
-        <w:tc>
-          <w:tcPr/>
-          <w:p>
-            <w:pPr>
-              <w:pStyle w:val="Compact"/>
-            </w:pPr>
-            <w:r>
-              <w:t xml:space="preserve">209</w:t>
-            </w:r>
-          </w:p>
-        </w:tc>
-        <w:tc>
-          <w:tcPr/>
-          <w:p>
-            <w:pPr>
-              <w:pStyle w:val="Compact"/>
-            </w:pPr>
-            <w:r>
-              <w:t xml:space="preserve">113606.88</w:t>
-            </w:r>
-          </w:p>
-        </w:tc>
-        <w:tc>
-          <w:tcPr/>
-          <w:p>
-            <w:pPr>
-              <w:pStyle w:val="Compact"/>
-            </w:pPr>
-            <w:r>
-              <w:t xml:space="preserve">578.75</w:t>
-            </w:r>
-          </w:p>
-        </w:tc>
-        <w:tc>
-          <w:tcPr/>
-          <w:p>
-            <w:pPr>
-              <w:pStyle w:val="Compact"/>
-            </w:pPr>
-            <w:r>
-              <w:t xml:space="preserve">61</w:t>
-            </w:r>
-          </w:p>
-        </w:tc>
-      </w:tr>
-      <w:tr>
-        <w:tc>
-          <w:tcPr/>
-          <w:p>
-            <w:pPr>
-              <w:pStyle w:val="Compact"/>
-            </w:pPr>
-            <w:r>
-              <w:t xml:space="preserve">P002</w:t>
-            </w:r>
-          </w:p>
-        </w:tc>
-        <w:tc>
-          <w:tcPr/>
-          <w:p>
-            <w:pPr>
-              <w:pStyle w:val="Compact"/>
-            </w:pPr>
-            <w:r>
-              <w:t xml:space="preserve">286</w:t>
-            </w:r>
-          </w:p>
-        </w:tc>
-        <w:tc>
-          <w:tcPr/>
-          <w:p>
-            <w:pPr>
-              <w:pStyle w:val="Compact"/>
-            </w:pPr>
-            <w:r>
-              <w:t xml:space="preserve">181419.36</w:t>
-            </w:r>
-          </w:p>
-        </w:tc>
-        <w:tc>
-          <w:tcPr/>
-          <w:p>
-            <w:pPr>
-              <w:pStyle w:val="Compact"/>
-            </w:pPr>
-            <w:r>
-              <w:t xml:space="preserve">610.29</w:t>
-            </w:r>
-          </w:p>
-        </w:tc>
-        <w:tc>
-          <w:tcPr/>
-          <w:p>
-            <w:pPr>
-              <w:pStyle w:val="Compact"/>
-            </w:pPr>
-            <w:r>
-              <w:t xml:space="preserve">46</w:t>
-            </w:r>
-          </w:p>
-        </w:tc>
-      </w:tr>
-      <w:tr>
-        <w:tc>
-          <w:tcPr/>
-          <w:p>
-            <w:pPr>
-              <w:pStyle w:val="Compact"/>
-            </w:pPr>
-            <w:r>
-              <w:t xml:space="preserve">P003</w:t>
-            </w:r>
-          </w:p>
-        </w:tc>
-        <w:tc>
-          <w:tcPr/>
-          <w:p>
-            <w:pPr>
-              <w:pStyle w:val="Compact"/>
-            </w:pPr>
-            <w:r>
-              <w:t xml:space="preserve">369</w:t>
-            </w:r>
-          </w:p>
-        </w:tc>
-        <w:tc>
-          <w:tcPr/>
-          <w:p>
-            <w:pPr>
-              <w:pStyle w:val="Compact"/>
-            </w:pPr>
-            <w:r>
-              <w:t xml:space="preserve">253591.20</w:t>
-            </w:r>
-          </w:p>
-        </w:tc>
-        <w:tc>
-          <w:tcPr/>
-          <w:p>
-            <w:pPr>
-              <w:pStyle w:val="Compact"/>
-            </w:pPr>
-            <w:r>
-              <w:t xml:space="preserve">540.84</w:t>
-            </w:r>
-          </w:p>
-        </w:tc>
-        <w:tc>
-          <w:tcPr/>
-          <w:p>
-            <w:pPr>
-              <w:pStyle w:val="Compact"/>
-            </w:pPr>
-            <w:r>
-              <w:t xml:space="preserve">61</w:t>
-            </w:r>
-          </w:p>
-        </w:tc>
-      </w:tr>
-      <w:tr>
-        <w:tc>
-          <w:tcPr/>
-          <w:p>
-            <w:pPr>
-              <w:pStyle w:val="Compact"/>
-            </w:pPr>
-            <w:r>
-              <w:t xml:space="preserve">P004</w:t>
-            </w:r>
-          </w:p>
-        </w:tc>
-        <w:tc>
-          <w:tcPr/>
-          <w:p>
-            <w:pPr>
-              <w:pStyle w:val="Compact"/>
-            </w:pPr>
-            <w:r>
-              <w:t xml:space="preserve">517</w:t>
-            </w:r>
-          </w:p>
-        </w:tc>
-        <w:tc>
-          <w:tcPr/>
-          <w:p>
-            <w:pPr>
-              <w:pStyle w:val="Compact"/>
-            </w:pPr>
-            <w:r>
-              <w:t xml:space="preserve">320932.69</w:t>
-            </w:r>
-          </w:p>
-        </w:tc>
-        <w:tc>
-          <w:tcPr/>
-          <w:p>
-            <w:pPr>
-              <w:pStyle w:val="Compact"/>
-            </w:pPr>
-            <w:r>
-              <w:t xml:space="preserve">577.04</w:t>
-            </w:r>
-          </w:p>
-        </w:tc>
-        <w:tc>
-          <w:tcPr/>
-          <w:p>
-            <w:pPr>
-              <w:pStyle w:val="Compact"/>
-            </w:pPr>
-            <w:r>
-              <w:t xml:space="preserve">61</w:t>
-            </w:r>
-          </w:p>
-        </w:tc>
-      </w:tr>
-    </w:tbl>
-    <w:p>
-      <w:pPr>
-        <w:pStyle w:val="BodyText"/>
-      </w:pPr>
-      <w:r>
-        <w:t xml:space="preserve">Tabell 5.4 Strukturert havneoversikt brukt videre i modellgrunnlaget.</w:t>
+        <w:t xml:space="preserve">fremstår som den dyreste havnen. Dette indikerer at havnevalg har potensial til å påvirke totale drivstoffkostnader og støtter relevansen av å utvikle en optimeringsmodell basert på datasettet. Den strukturerte havneinformasjonen er vist tidligere i Tabell 4.1 og brukes videre som prisgrunnlag i modelleringen.</w:t>
       </w:r>
     </w:p>
     <w:p>
@@ -4628,7 +4361,7 @@
         <w:pStyle w:val="BodyText"/>
       </w:pPr>
       <w:r>
-        <w:t xml:space="preserve">Tabell 5.5 oppsummerer de oppgitte tankkapasitetene for de anonymiserte fartøyklassene. Tallene er oppgitt som verifiserte 2025-tall fra dataleverandøren og brukes som kapasitetsrestriksjoner i hovedmodellen.</w:t>
+        <w:t xml:space="preserve">Tabell 5.4 oppsummerer de oppgitte tankkapasitetene for de anonymiserte fartøyklassene. Tallene er oppgitt som verifiserte 2025-tall fra dataleverandøren og brukes som kapasitetsrestriksjoner i hovedmodellen.</w:t>
       </w:r>
     </w:p>
     <w:tbl>
@@ -4794,15 +4527,15 @@
         <w:pStyle w:val="BodyText"/>
       </w:pPr>
       <w:r>
-        <w:t xml:space="preserve">Tabell 5.5 Verifisert bunkerskapasitet per anonymisert fartøyklasse brukt som kapasitetsparameter i hovedmodellen.</w:t>
-      </w:r>
-    </w:p>
-    <w:p>
-      <w:pPr>
-        <w:pStyle w:val="BodyText"/>
-      </w:pPr>
-      <w:r>
-        <w:t xml:space="preserve">Tabell 5.6 oppsummerer de supplerende voyage-dataene. Tabellen dokumenterer omfang, kvalitet og hvordan dataene brukes i den operative hovedmodellen. Voyage-dataene gir ikke prisparametere, men de inngår direkte i modellens rutesekvens, forbruksbehov, startbeholdning, havnetilgjengelighet og kapasitetsrestriksjoner.</w:t>
+        <w:t xml:space="preserve">Tabell 5.4 Verifisert bunkerskapasitet per anonymisert fartøyklasse brukt som kapasitetsparameter i hovedmodellen.</w:t>
+      </w:r>
+    </w:p>
+    <w:p>
+      <w:pPr>
+        <w:pStyle w:val="BodyText"/>
+      </w:pPr>
+      <w:r>
+        <w:t xml:space="preserve">Tabell 5.5 oppsummerer enheter og kostnadsgrunnlag i rapporten. Tabellen er viktig fordi casebeskrivelsen bruker metriske tonn som bakgrunnstall, mens modelleringen bygger på de enhetene som finnes i de mottatte pris-, forbruks-, ROB- og kapasitetsfeltene.</w:t>
       </w:r>
     </w:p>
     <w:tbl>
@@ -4839,6 +4572,248 @@
               <w:pStyle w:val="Compact"/>
             </w:pPr>
             <w:r>
+              <w:t xml:space="preserve">Enhet i rapporten</w:t>
+            </w:r>
+          </w:p>
+        </w:tc>
+        <w:tc>
+          <w:tcPr/>
+          <w:p>
+            <w:pPr>
+              <w:pStyle w:val="Compact"/>
+            </w:pPr>
+            <w:r>
+              <w:t xml:space="preserve">Datagrunnlag og tolkning</w:t>
+            </w:r>
+          </w:p>
+        </w:tc>
+      </w:tr>
+      <w:tr>
+        <w:tc>
+          <w:tcPr/>
+          <w:p>
+            <w:pPr>
+              <w:pStyle w:val="Compact"/>
+            </w:pPr>
+            <w:r>
+              <w:t xml:space="preserve">Casevolum</w:t>
+            </w:r>
+          </w:p>
+        </w:tc>
+        <w:tc>
+          <w:tcPr/>
+          <w:p>
+            <w:pPr>
+              <w:pStyle w:val="Compact"/>
+            </w:pPr>
+            <w:r>
+              <w:t xml:space="preserve">Metriske tonn</w:t>
+            </w:r>
+          </w:p>
+        </w:tc>
+        <w:tc>
+          <w:tcPr/>
+          <w:p>
+            <w:pPr>
+              <w:pStyle w:val="Compact"/>
+            </w:pPr>
+            <w:r>
+              <w:t xml:space="preserve">Bakgrunnstall oppgitt av casebedriften</w:t>
+            </w:r>
+          </w:p>
+        </w:tc>
+      </w:tr>
+      <w:tr>
+        <w:tc>
+          <w:tcPr/>
+          <w:p>
+            <w:pPr>
+              <w:pStyle w:val="Compact"/>
+            </w:pPr>
+            <w:r>
+              <w:t xml:space="preserve">Modellert forbruk, kjøp og ekstern/ukjent bunkring</w:t>
+            </w:r>
+          </w:p>
+        </w:tc>
+        <w:tc>
+          <w:tcPr/>
+          <w:p>
+            <w:pPr>
+              <w:pStyle w:val="Compact"/>
+            </w:pPr>
+            <w:r>
+              <w:t xml:space="preserve">Modellens mengdeenheter</w:t>
+            </w:r>
+          </w:p>
+        </w:tc>
+        <w:tc>
+          <w:tcPr/>
+          <w:p>
+            <w:pPr>
+              <w:pStyle w:val="Compact"/>
+            </w:pPr>
+            <w:r>
+              <w:t xml:space="preserve">Hentet fra forbruks-, ROB- og bunkringsfeltene; behandles konsistent internt i modellen</w:t>
+            </w:r>
+          </w:p>
+        </w:tc>
+      </w:tr>
+      <w:tr>
+        <w:tc>
+          <w:tcPr/>
+          <w:p>
+            <w:pPr>
+              <w:pStyle w:val="Compact"/>
+            </w:pPr>
+            <w:r>
+              <w:t xml:space="preserve">Bunkerskapasitet</w:t>
+            </w:r>
+          </w:p>
+        </w:tc>
+        <w:tc>
+          <w:tcPr/>
+          <w:p>
+            <w:pPr>
+              <w:pStyle w:val="Compact"/>
+            </w:pPr>
+            <w:r>
+              <w:t xml:space="preserve">m3</w:t>
+            </w:r>
+          </w:p>
+        </w:tc>
+        <w:tc>
+          <w:tcPr/>
+          <w:p>
+            <w:pPr>
+              <w:pStyle w:val="Compact"/>
+            </w:pPr>
+            <w:r>
+              <w:t xml:space="preserve">Verifiserte 2025-tall fra dataleverandøren; ikke avklart om tallene er total eller operativ kapasitet</w:t>
+            </w:r>
+          </w:p>
+        </w:tc>
+      </w:tr>
+      <w:tr>
+        <w:tc>
+          <w:tcPr/>
+          <w:p>
+            <w:pPr>
+              <w:pStyle w:val="Compact"/>
+            </w:pPr>
+            <w:r>
+              <w:t xml:space="preserve">Pris og kostnad</w:t>
+            </w:r>
+          </w:p>
+        </w:tc>
+        <w:tc>
+          <w:tcPr/>
+          <w:p>
+            <w:pPr>
+              <w:pStyle w:val="Compact"/>
+            </w:pPr>
+            <w:r>
+              <w:t xml:space="preserve">Datasettets kostnadsenheter</w:t>
+            </w:r>
+          </w:p>
+        </w:tc>
+        <w:tc>
+          <w:tcPr/>
+          <w:p>
+            <w:pPr>
+              <w:pStyle w:val="Compact"/>
+            </w:pPr>
+            <w:r>
+              <w:t xml:space="preserve">Beregnet fra prisfeltene i bunkringsdatasettet; valuta er ikke uavhengig verifisert i rapportgrunnlaget</w:t>
+            </w:r>
+          </w:p>
+        </w:tc>
+      </w:tr>
+      <w:tr>
+        <w:tc>
+          <w:tcPr/>
+          <w:p>
+            <w:pPr>
+              <w:pStyle w:val="Compact"/>
+            </w:pPr>
+            <w:r>
+              <w:t xml:space="preserve">Ekstern/ukjent proxypris</w:t>
+            </w:r>
+          </w:p>
+        </w:tc>
+        <w:tc>
+          <w:tcPr/>
+          <w:p>
+            <w:pPr>
+              <w:pStyle w:val="Compact"/>
+            </w:pPr>
+            <w:r>
+              <w:t xml:space="preserve">Datasettets kostnadsenheter per modellert enhet</w:t>
+            </w:r>
+          </w:p>
+        </w:tc>
+        <w:tc>
+          <w:tcPr/>
+          <w:p>
+            <w:pPr>
+              <w:pStyle w:val="Compact"/>
+            </w:pPr>
+            <w:r>
+              <w:t xml:space="preserve">Intern arbeidsantagelse beregnet som 1,25 ganger høyeste historiske havnesnitt</w:t>
+            </w:r>
+          </w:p>
+        </w:tc>
+      </w:tr>
+    </w:tbl>
+    <w:p>
+      <w:pPr>
+        <w:pStyle w:val="BodyText"/>
+      </w:pPr>
+      <w:r>
+        <w:t xml:space="preserve">Tabell 5.5 Enheter og kostnadsgrunnlag brukt i rapport og modell.</w:t>
+      </w:r>
+    </w:p>
+    <w:p>
+      <w:pPr>
+        <w:pStyle w:val="BodyText"/>
+      </w:pPr>
+      <w:r>
+        <w:t xml:space="preserve">Tabell 5.6 oppsummerer de supplerende voyage-dataene. Tabellen dokumenterer omfang, kvalitet og hvordan dataene brukes i den operative hovedmodellen. Voyage-dataene gir ikke prisparametere, men de inngår direkte i modellens rutesekvens, forbruksbehov, startbeholdning, havnetilgjengelighet og kapasitetsrestriksjoner.</w:t>
+      </w:r>
+    </w:p>
+    <w:tbl>
+      <w:tblPr>
+        <w:tblStyle w:val="Table"/>
+        <w:tblW w:type="pct" w:w="5000"/>
+        <w:tblLayout w:type="fixed"/>
+        <w:tblLook w:firstRow="1" w:lastRow="0" w:firstColumn="0" w:lastColumn="0" w:noHBand="0" w:noVBand="0" w:val="0020"/>
+      </w:tblPr>
+      <w:tblGrid>
+        <w:gridCol w:w="2640"/>
+        <w:gridCol w:w="2640"/>
+        <w:gridCol w:w="2640"/>
+      </w:tblGrid>
+      <w:tr>
+        <w:trPr>
+          <w:tblHeader w:val="on"/>
+        </w:trPr>
+        <w:tc>
+          <w:tcPr/>
+          <w:p>
+            <w:pPr>
+              <w:pStyle w:val="Compact"/>
+            </w:pPr>
+            <w:r>
+              <w:t xml:space="preserve">Element</w:t>
+            </w:r>
+          </w:p>
+        </w:tc>
+        <w:tc>
+          <w:tcPr/>
+          <w:p>
+            <w:pPr>
+              <w:pStyle w:val="Compact"/>
+            </w:pPr>
+            <w:r>
               <w:t xml:space="preserve">Verdi</w:t>
             </w:r>
           </w:p>
@@ -5463,6 +5438,56 @@
     <w:p>
       <w:pPr>
         <w:pStyle w:val="FirstParagraph"/>
+      </w:pPr>
+      <w:r>
+        <w:t xml:space="preserve">Sentrale forkortelser som</w:t>
+      </w:r>
+      <w:r>
+        <w:t xml:space="preserve"> </w:t>
+      </w:r>
+      <w:r>
+        <w:rPr>
+          <w:rStyle w:val="VerbatimChar"/>
+        </w:rPr>
+        <w:t xml:space="preserve">ROB</w:t>
+      </w:r>
+      <w:r>
+        <w:t xml:space="preserve">,</w:t>
+      </w:r>
+      <w:r>
+        <w:t xml:space="preserve"> </w:t>
+      </w:r>
+      <w:r>
+        <w:rPr>
+          <w:rStyle w:val="VerbatimChar"/>
+        </w:rPr>
+        <w:t xml:space="preserve">LP</w:t>
+      </w:r>
+      <w:r>
+        <w:t xml:space="preserve"> </w:t>
+      </w:r>
+      <w:r>
+        <w:t xml:space="preserve">og</w:t>
+      </w:r>
+      <w:r>
+        <w:t xml:space="preserve"> </w:t>
+      </w:r>
+      <w:r>
+        <w:rPr>
+          <w:rStyle w:val="VerbatimChar"/>
+        </w:rPr>
+        <w:t xml:space="preserve">LSF</w:t>
+      </w:r>
+      <w:r>
+        <w:t xml:space="preserve"> </w:t>
+      </w:r>
+      <w:r>
+        <w:t xml:space="preserve">er samlet i Vedlegg C.</w:t>
+      </w:r>
+    </w:p>
+    <w:p>
+      <w:pPr>
+        <w:pStyle w:val="BodyText"/>
       </w:pPr>
       <w:r>
         <w:t xml:space="preserve">La:</w:t>
@@ -7190,7 +7215,7 @@
         <w:pStyle w:val="FirstParagraph"/>
       </w:pPr>
       <w:r>
-        <w:t xml:space="preserve">Hovedkjøringen bruker en ekstern proxypris på 762,86 per enhet, beregnet som 1,25 ganger høyeste historiske havnesnitt blant modellhavnene. Fordi proxyprisen er høyere enn prisene i modellhavnene, fungerer ekstern/ukjent bunkring som en kostbar reservekategori. Modellen bruker den derfor primært når den ikke kan dekke forbruket gjennom prisede modellhavner innenfor rute- og kapasitetsbegrensningene.</w:t>
+        <w:t xml:space="preserve">Hovedkjøringen bruker en ekstern proxypris på 762,86 per enhet, beregnet som 1,25 ganger høyeste historiske havnesnitt blant modellhavnene. Dette er en intern arbeidsantagelse fra samme prisgrunnlag som modellen optimerer på, ikke en uavhengig markedspris for faktisk ekstern bunkring. Fordi proxyprisen er høyere enn prisene i modellhavnene, fungerer ekstern/ukjent bunkring som en kostbar reservekategori. Modellen bruker den derfor primært når den ikke kan dekke forbruket gjennom prisede modellhavner innenfor rute- og kapasitetsbegrensningene.</w:t>
       </w:r>
     </w:p>
     <w:p>
@@ -7524,6 +7549,31 @@
           </w:p>
         </w:tc>
       </w:tr>
+      <w:tr>
+        <w:tc>
+          <w:tcPr/>
+          <w:p>
+            <w:pPr>
+              <w:pStyle w:val="Compact"/>
+            </w:pPr>
+            <w:r>
+              <w:t xml:space="preserve">Avvik som andel av gjennomsnittlig modellkapasitet</w:t>
+            </w:r>
+          </w:p>
+        </w:tc>
+        <w:tc>
+          <w:tcPr/>
+          <w:p>
+            <w:pPr>
+              <w:pStyle w:val="Compact"/>
+              <w:jc w:val="right"/>
+            </w:pPr>
+            <w:r>
+              <w:t xml:space="preserve">26,91 %</w:t>
+            </w:r>
+          </w:p>
+        </w:tc>
+      </w:tr>
     </w:tbl>
     <w:p>
       <w:pPr>
@@ -7538,7 +7588,7 @@
         <w:pStyle w:val="BodyText"/>
       </w:pPr>
       <w:r>
-        <w:t xml:space="preserve">Valideringen viser at modellen ikke gjenskaper de samme bunkringstidspunktene som observert praksis. Dette er forventet, fordi modellen søker en kostnadsminimerende løsning og ikke er trent til å kopiere historiske beslutninger. Samtidig er samlet modellert bunkringsmengde svært nær estimert observert bunkringsmengde. Det styrker tolkningen av modellen som operativt rimelig på aggregert nivå, selv om timing og havnedekning fortsatt må vurderes faglig før praktisk bruk.</w:t>
+        <w:t xml:space="preserve">Valideringen viser at modellen ikke gjenskaper de samme bunkringstidspunktene som observert praksis. Dette er forventet, fordi modellen søker en kostnadsminimerende løsning og ikke er trent til å kopiere historiske beslutninger. Samtidig er samlet modellert bunkringsmengde svært nær estimert observert bunkringsmengde. Det styrker tolkningen av modellen som operativt rimelig på aggregert nivå. Slutt-ROB-avviket er likevel ikke ubetydelig når det tilsvarer 26,91 % av gjennomsnittlig modellkapasitet, og timing og havnedekning må derfor vurderes faglig før praktisk bruk.</w:t>
       </w:r>
     </w:p>
     <w:p>
@@ -7550,7 +7600,7 @@
     </w:p>
     <w:bookmarkEnd w:id="62"/>
     <w:bookmarkEnd w:id="63"/>
-    <w:bookmarkStart w:id="72" w:name="resultat"/>
+    <w:bookmarkStart w:id="73" w:name="resultat"/>
     <w:p>
       <w:pPr>
         <w:pStyle w:val="Heading2"/>
@@ -7564,7 +7614,7 @@
         <w:pStyle w:val="FirstParagraph"/>
       </w:pPr>
       <w:r>
-        <w:t xml:space="preserve">Dette kapittelet presenterer resultatene fra den operative hovedmodellen, basiskjøringen og sensitivitetsanalysen. Alle beløp er oppgitt i datasettets kostnadsenheter. Kapittelet presenterer funnene nøkternt; vurdering av implikasjoner og begrensninger gjøres i diskusjonskapitlet.</w:t>
+        <w:t xml:space="preserve">Dette kapittelet presenterer resultatene fra den operative hovedmodellen, en naiv benchmark, basiskjøringen og sensitivitetsanalysen. Alle beløp er oppgitt i datasettets kostnadsenheter. Kapittelet presenterer funnene nøkternt; vurdering av implikasjoner og begrensninger gjøres i diskusjonskapitlet.</w:t>
       </w:r>
     </w:p>
     <w:bookmarkStart w:id="64" w:name="hovedresultat"/>
@@ -10068,13 +10118,13 @@
       </w:r>
     </w:p>
     <w:bookmarkEnd w:id="67"/>
-    <w:bookmarkStart w:id="71" w:name="sensitivitet-for-ekstern-proxypris"/>
+    <w:bookmarkStart w:id="68" w:name="naiv-benchmark"/>
     <w:p>
       <w:pPr>
         <w:pStyle w:val="Heading3"/>
       </w:pPr>
       <w:r>
-        <w:t xml:space="preserve">8.5 Sensitivitet for ekstern proxypris</w:t>
+        <w:t xml:space="preserve">8.5 Naiv benchmark</w:t>
       </w:r>
     </w:p>
     <w:p>
@@ -10082,7 +10132,352 @@
         <w:pStyle w:val="FirstParagraph"/>
       </w:pPr>
       <w:r>
-        <w:t xml:space="preserve">Tabell 8.5 viser sensitivitetsanalysen for proxykostnaden på ekstern/ukjent bunkring. Kjøpsmengdene er stabile i de tre scenarioene, men total modellkostnad endres med proxyprisen. Kostnadsspennet mellom laveste og høyeste scenario er 5 190 071,68.</w:t>
+        <w:t xml:space="preserve">For å gi modellen et enkelt sammenligningsgrunnlag er det beregnet en naiv benchmark. Referanseregelen fyller til kapasitet i billigste tilgjengelige prisede modellhavn når en av modellhavnene er tilgjengelig på etappen. Dersom beholdningen likevel ikke dekker etappeforbruket, brukes ekstern/ukjent bunkring med samme proxypris som i hovedmodellen. Benchmarken er ikke en rekonstruksjon av faktisk Odfjell-praksis, men en enkel referanse innenfor samme datagrunnlag.</w:t>
+      </w:r>
+    </w:p>
+    <w:tbl>
+      <w:tblPr>
+        <w:tblStyle w:val="Table"/>
+        <w:tblW w:type="pct" w:w="5000"/>
+        <w:tblLayout w:type="fixed"/>
+        <w:tblLook w:firstRow="1" w:lastRow="0" w:firstColumn="0" w:lastColumn="0" w:noHBand="0" w:noVBand="0" w:val="0020"/>
+      </w:tblPr>
+      <w:tblGrid>
+        <w:gridCol w:w="1584"/>
+        <w:gridCol w:w="2112"/>
+        <w:gridCol w:w="2112"/>
+        <w:gridCol w:w="2112"/>
+      </w:tblGrid>
+      <w:tr>
+        <w:trPr>
+          <w:tblHeader w:val="on"/>
+        </w:trPr>
+        <w:tc>
+          <w:tcPr/>
+          <w:p>
+            <w:pPr>
+              <w:pStyle w:val="Compact"/>
+            </w:pPr>
+            <w:r>
+              <w:t xml:space="preserve">Mål</w:t>
+            </w:r>
+          </w:p>
+        </w:tc>
+        <w:tc>
+          <w:tcPr/>
+          <w:p>
+            <w:pPr>
+              <w:pStyle w:val="Compact"/>
+              <w:jc w:val="right"/>
+            </w:pPr>
+            <w:r>
+              <w:t xml:space="preserve">LP-modell</w:t>
+            </w:r>
+          </w:p>
+        </w:tc>
+        <w:tc>
+          <w:tcPr/>
+          <w:p>
+            <w:pPr>
+              <w:pStyle w:val="Compact"/>
+              <w:jc w:val="right"/>
+            </w:pPr>
+            <w:r>
+              <w:t xml:space="preserve">Naiv benchmark</w:t>
+            </w:r>
+          </w:p>
+        </w:tc>
+        <w:tc>
+          <w:tcPr/>
+          <w:p>
+            <w:pPr>
+              <w:pStyle w:val="Compact"/>
+              <w:jc w:val="right"/>
+            </w:pPr>
+            <w:r>
+              <w:t xml:space="preserve">Forskjell</w:t>
+            </w:r>
+          </w:p>
+        </w:tc>
+      </w:tr>
+      <w:tr>
+        <w:tc>
+          <w:tcPr/>
+          <w:p>
+            <w:pPr>
+              <w:pStyle w:val="Compact"/>
+            </w:pPr>
+            <w:r>
+              <w:t xml:space="preserve">Kjøp i prisede havner</w:t>
+            </w:r>
+          </w:p>
+        </w:tc>
+        <w:tc>
+          <w:tcPr/>
+          <w:p>
+            <w:pPr>
+              <w:pStyle w:val="Compact"/>
+              <w:jc w:val="right"/>
+            </w:pPr>
+            <w:r>
+              <w:t xml:space="preserve">18 857,45</w:t>
+            </w:r>
+          </w:p>
+        </w:tc>
+        <w:tc>
+          <w:tcPr/>
+          <w:p>
+            <w:pPr>
+              <w:pStyle w:val="Compact"/>
+              <w:jc w:val="right"/>
+            </w:pPr>
+            <w:r>
+              <w:t xml:space="preserve">22 747,30</w:t>
+            </w:r>
+          </w:p>
+        </w:tc>
+        <w:tc>
+          <w:tcPr/>
+          <w:p>
+            <w:pPr>
+              <w:pStyle w:val="Compact"/>
+              <w:jc w:val="right"/>
+            </w:pPr>
+            <w:r>
+              <w:t xml:space="preserve">3 889,85</w:t>
+            </w:r>
+          </w:p>
+        </w:tc>
+      </w:tr>
+      <w:tr>
+        <w:tc>
+          <w:tcPr/>
+          <w:p>
+            <w:pPr>
+              <w:pStyle w:val="Compact"/>
+            </w:pPr>
+            <w:r>
+              <w:t xml:space="preserve">Ekstern/ukjent bunkring</w:t>
+            </w:r>
+          </w:p>
+        </w:tc>
+        <w:tc>
+          <w:tcPr/>
+          <w:p>
+            <w:pPr>
+              <w:pStyle w:val="Compact"/>
+              <w:jc w:val="right"/>
+            </w:pPr>
+            <w:r>
+              <w:t xml:space="preserve">21 260,62</w:t>
+            </w:r>
+          </w:p>
+        </w:tc>
+        <w:tc>
+          <w:tcPr/>
+          <w:p>
+            <w:pPr>
+              <w:pStyle w:val="Compact"/>
+              <w:jc w:val="right"/>
+            </w:pPr>
+            <w:r>
+              <w:t xml:space="preserve">21 260,62</w:t>
+            </w:r>
+          </w:p>
+        </w:tc>
+        <w:tc>
+          <w:tcPr/>
+          <w:p>
+            <w:pPr>
+              <w:pStyle w:val="Compact"/>
+              <w:jc w:val="right"/>
+            </w:pPr>
+            <w:r>
+              <w:t xml:space="preserve">0,00</w:t>
+            </w:r>
+          </w:p>
+        </w:tc>
+      </w:tr>
+      <w:tr>
+        <w:tc>
+          <w:tcPr/>
+          <w:p>
+            <w:pPr>
+              <w:pStyle w:val="Compact"/>
+            </w:pPr>
+            <w:r>
+              <w:t xml:space="preserve">Kostnad i prisede havner</w:t>
+            </w:r>
+          </w:p>
+        </w:tc>
+        <w:tc>
+          <w:tcPr/>
+          <w:p>
+            <w:pPr>
+              <w:pStyle w:val="Compact"/>
+              <w:jc w:val="right"/>
+            </w:pPr>
+            <w:r>
+              <w:t xml:space="preserve">10 406 690,70</w:t>
+            </w:r>
+          </w:p>
+        </w:tc>
+        <w:tc>
+          <w:tcPr/>
+          <w:p>
+            <w:pPr>
+              <w:pStyle w:val="Compact"/>
+              <w:jc w:val="right"/>
+            </w:pPr>
+            <w:r>
+              <w:t xml:space="preserve">12 707 348,69</w:t>
+            </w:r>
+          </w:p>
+        </w:tc>
+        <w:tc>
+          <w:tcPr/>
+          <w:p>
+            <w:pPr>
+              <w:pStyle w:val="Compact"/>
+              <w:jc w:val="right"/>
+            </w:pPr>
+            <w:r>
+              <w:t xml:space="preserve">2 300 657,99</w:t>
+            </w:r>
+          </w:p>
+        </w:tc>
+      </w:tr>
+      <w:tr>
+        <w:tc>
+          <w:tcPr/>
+          <w:p>
+            <w:pPr>
+              <w:pStyle w:val="Compact"/>
+            </w:pPr>
+            <w:r>
+              <w:t xml:space="preserve">Ekstern kostnad</w:t>
+            </w:r>
+          </w:p>
+        </w:tc>
+        <w:tc>
+          <w:tcPr/>
+          <w:p>
+            <w:pPr>
+              <w:pStyle w:val="Compact"/>
+              <w:jc w:val="right"/>
+            </w:pPr>
+            <w:r>
+              <w:t xml:space="preserve">16 218 974,08</w:t>
+            </w:r>
+          </w:p>
+        </w:tc>
+        <w:tc>
+          <w:tcPr/>
+          <w:p>
+            <w:pPr>
+              <w:pStyle w:val="Compact"/>
+              <w:jc w:val="right"/>
+            </w:pPr>
+            <w:r>
+              <w:t xml:space="preserve">16 218 974,08</w:t>
+            </w:r>
+          </w:p>
+        </w:tc>
+        <w:tc>
+          <w:tcPr/>
+          <w:p>
+            <w:pPr>
+              <w:pStyle w:val="Compact"/>
+              <w:jc w:val="right"/>
+            </w:pPr>
+            <w:r>
+              <w:t xml:space="preserve">0,00</w:t>
+            </w:r>
+          </w:p>
+        </w:tc>
+      </w:tr>
+      <w:tr>
+        <w:tc>
+          <w:tcPr/>
+          <w:p>
+            <w:pPr>
+              <w:pStyle w:val="Compact"/>
+            </w:pPr>
+            <w:r>
+              <w:t xml:space="preserve">Total modellkostnad</w:t>
+            </w:r>
+          </w:p>
+        </w:tc>
+        <w:tc>
+          <w:tcPr/>
+          <w:p>
+            <w:pPr>
+              <w:pStyle w:val="Compact"/>
+              <w:jc w:val="right"/>
+            </w:pPr>
+            <w:r>
+              <w:t xml:space="preserve">26 625 664,78</w:t>
+            </w:r>
+          </w:p>
+        </w:tc>
+        <w:tc>
+          <w:tcPr/>
+          <w:p>
+            <w:pPr>
+              <w:pStyle w:val="Compact"/>
+              <w:jc w:val="right"/>
+            </w:pPr>
+            <w:r>
+              <w:t xml:space="preserve">28 926 322,77</w:t>
+            </w:r>
+          </w:p>
+        </w:tc>
+        <w:tc>
+          <w:tcPr/>
+          <w:p>
+            <w:pPr>
+              <w:pStyle w:val="Compact"/>
+              <w:jc w:val="right"/>
+            </w:pPr>
+            <w:r>
+              <w:t xml:space="preserve">2 300 657,99</w:t>
+            </w:r>
+          </w:p>
+        </w:tc>
+      </w:tr>
+    </w:tbl>
+    <w:p>
+      <w:pPr>
+        <w:pStyle w:val="BodyText"/>
+      </w:pPr>
+      <w:r>
+        <w:t xml:space="preserve">Tabell 8.5 Sammenligning mellom LP-modell og naiv benchmark.</w:t>
+      </w:r>
+    </w:p>
+    <w:p>
+      <w:pPr>
+        <w:pStyle w:val="BodyText"/>
+      </w:pPr>
+      <w:r>
+        <w:t xml:space="preserve">Benchmarken viser at LP-modellen gir 2 300 657,99 lavere modellkostnad enn den naive referanseregelen. Forskjellen kommer fra lavere kjøp i prisede havner, ikke fra lavere ekstern/ukjent bunkring. Tolkningen er derfor avgrenset: resultatet viser at modellen er bedre enn en enkel fyll-til-kapasitet-regel innenfor samme pris- og rutegrunnlag, men det dokumenterer ikke besparelse mot faktisk historisk innkjøpspraksis.</w:t>
+      </w:r>
+    </w:p>
+    <w:bookmarkEnd w:id="68"/>
+    <w:bookmarkStart w:id="72" w:name="sensitivitet-for-ekstern-proxypris"/>
+    <w:p>
+      <w:pPr>
+        <w:pStyle w:val="Heading3"/>
+      </w:pPr>
+      <w:r>
+        <w:t xml:space="preserve">8.6 Sensitivitet for ekstern proxypris</w:t>
+      </w:r>
+    </w:p>
+    <w:p>
+      <w:pPr>
+        <w:pStyle w:val="FirstParagraph"/>
+      </w:pPr>
+      <w:r>
+        <w:t xml:space="preserve">Tabell 8.6 viser sensitivitetsanalysen for proxykostnaden på ekstern/ukjent bunkring. Kjøpsmengdene er stabile i de tre scenarioene, men total modellkostnad endres med proxyprisen. Kostnadsspennet mellom laveste og høyeste scenario er 5 190 071,68.</w:t>
       </w:r>
     </w:p>
     <w:tbl>
@@ -10356,7 +10751,7 @@
         <w:pStyle w:val="BodyText"/>
       </w:pPr>
       <w:r>
-        <w:t xml:space="preserve">Tabell 8.5 Sensitivitetsanalyse for ekstern/ukjent bunkringskostnad.</w:t>
+        <w:t xml:space="preserve">Tabell 8.6 Sensitivitetsanalyse for ekstern/ukjent bunkringskostnad.</w:t>
       </w:r>
     </w:p>
     <w:p>
@@ -10368,18 +10763,18 @@
           <wp:inline>
             <wp:extent cx="4267200" cy="2667000"/>
             <wp:effectExtent b="0" l="0" r="0" t="0"/>
-            <wp:docPr descr="Kostnadskomponenter per proxyfaktor" title="" id="69" name="Picture"/>
+            <wp:docPr descr="Kostnadskomponenter per proxyfaktor" title="" id="70" name="Picture"/>
             <a:graphic>
               <a:graphicData uri="http://schemas.openxmlformats.org/drawingml/2006/picture">
                 <pic:pic>
                   <pic:nvPicPr>
-                    <pic:cNvPr descr="../006 analysis/03_analyse/02_sensitivitetsanalyse/figures/fig_sensitivity_cost_components.png" id="70" name="Picture"/>
+                    <pic:cNvPr descr="../006 analysis/03_analyse/02_sensitivitetsanalyse/figures/fig_sensitivity_cost_components.png" id="71" name="Picture"/>
                     <pic:cNvPicPr>
                       <a:picLocks noChangeArrowheads="1" noChangeAspect="1"/>
                     </pic:cNvPicPr>
                   </pic:nvPicPr>
                   <pic:blipFill>
-                    <a:blip r:embed="rId68"/>
+                    <a:blip r:embed="rId69"/>
                     <a:stretch>
                       <a:fillRect/>
                     </a:stretch>
@@ -10790,7 +11185,7 @@
         <w:pStyle w:val="BodyText"/>
       </w:pPr>
       <w:r>
-        <w:t xml:space="preserve">Tabell 8.6 Kostnadssensitivitet ved lik prosentvis endring i modellhavnprisene, med uendret kjøpsplan.</w:t>
+        <w:t xml:space="preserve">Tabell 8.7 Kostnadssensitivitet ved lik prosentvis endring i modellhavnprisene, med uendret kjøpsplan.</w:t>
       </w:r>
     </w:p>
     <w:p>
@@ -10800,9 +11195,9 @@
         </w:pict>
       </w:r>
     </w:p>
-    <w:bookmarkEnd w:id="71"/>
     <w:bookmarkEnd w:id="72"/>
-    <w:bookmarkStart w:id="75" w:name="diskusjon"/>
+    <w:bookmarkEnd w:id="73"/>
+    <w:bookmarkStart w:id="76" w:name="diskusjon"/>
     <w:p>
       <w:pPr>
         <w:pStyle w:val="Heading2"/>
@@ -10824,18 +11219,41 @@
         <w:pStyle w:val="BodyText"/>
       </w:pPr>
       <w:r>
-        <w:t xml:space="preserve">Modellen bidrar med en konkret bunkringsplan under operative restriksjoner. Den viser hvor mye som bør fylles i prisede havner, hvordan beholdningen utvikler seg gjennom ruten, og hvor modellen må bruke ekstern/ukjent bunkring fordi prisgrunnlaget ikke dekker ruten. Dermed gir modellen både en kostnadsminimerende beslutning og en kvantitativ diagnose av datagapet.</w:t>
-      </w:r>
-    </w:p>
-    <w:p>
-      <w:pPr>
-        <w:pStyle w:val="BodyText"/>
-      </w:pPr>
-      <w:r>
-        <w:t xml:space="preserve">Den operative valideringen mot ROB-baserte bunkringshendelser viser samtidig at modellen ligger nær observert praksis på samlet volum, men ikke på timing. Modellen beregner 40 118,07 i samlet bunkringsmengde mot et observert estimat på 39 879,61, men overlapper bare med 16 av 76 observerte bunkringshendelser. Dette styrker vurderingen av at modellen er rimelig på aggregert nivå, samtidig som den ikke bør tolkes som en historisk rekonstruksjon av faktiske bunkringsbeslutninger.</w:t>
-      </w:r>
-    </w:p>
-    <w:bookmarkStart w:id="73" w:name="praktiske-og-faglige-implikasjoner"/>
+        <w:t xml:space="preserve">Modellen bidrar med en konkret bunkringsplan under operative restriksjoner. Den viser hvor mye som bør fylles i prisede havner, hvordan beholdningen utvikler seg gjennom ruten, og hvor modellen må bruke ekstern/ukjent bunkring fordi prisgrunnlaget ikke dekker ruten. Dermed gir modellen både en kostnadsminimerende beslutning og en kvantitativ diagnose av datagapet. Sammenligningen mot en naiv benchmark viser også at modellen gir lavere modellkostnad enn en enkel fyll-til-kapasitet-regel, men dette må forstås som intern modellvalidering og ikke som dokumentert besparelse mot faktisk historisk praksis.</w:t>
+      </w:r>
+    </w:p>
+    <w:p>
+      <w:pPr>
+        <w:pStyle w:val="BodyText"/>
+      </w:pPr>
+      <w:r>
+        <w:t xml:space="preserve">Den operative valideringen mot ROB-baserte bunkringshendelser viser samtidig at modellen ligger nær observert praksis på samlet volum, men ikke på timing. Modellen beregner 40 118,07 i samlet bunkringsmengde mot et observert estimat på 39 879,61, men overlapper bare med 16 av 76 observerte bunkringshendelser. Gjennomsnittlig absolutt avvik mot observert slutt-ROB er 476,06, tilsvarende 26,91 % av gjennomsnittlig modellkapasitet. Dette styrker vurderingen av at modellen er rimelig på aggregert nivå, samtidig som den ikke bør tolkes som en historisk rekonstruksjon av faktiske bunkringsbeslutninger.</w:t>
+      </w:r>
+    </w:p>
+    <w:p>
+      <w:pPr>
+        <w:pStyle w:val="BodyText"/>
+      </w:pPr>
+      <w:r>
+        <w:t xml:space="preserve">De tre delproblemene kan dermed besvares samlet. Først viser datavasken at historiske bunkringsdata kan renses og struktureres til et konsistent havn-måned-grunnlag, men med tydelige avgrensninger til</w:t>
+      </w:r>
+      <w:r>
+        <w:t xml:space="preserve"> </w:t>
+      </w:r>
+      <w:r>
+        <w:rPr>
+          <w:rStyle w:val="VerbatimChar"/>
+        </w:rPr>
+        <w:t xml:space="preserve">LSF</w:t>
+      </w:r>
+      <w:r>
+        <w:t xml:space="preserve"> </w:t>
+      </w:r>
+      <w:r>
+        <w:t xml:space="preserve">og fire havner. Deretter viser modelleringen at historiske prisdata kan kobles med voyage-data, forbruk, ROB og tankkapasitet i en lineær rute- og lagerbasert kostnadsmodell. Til slutt viser resultatene at modellen kan gi direkte beslutningsstøtte for fartøyfiler med god overlapp mot prisede modellhavner, mens høy ekstern/ukjent andel identifiserer datagap der resultatene ikke bør brukes som operative kjøpsforslag uten mer prisdata.</w:t>
+      </w:r>
+    </w:p>
+    <w:bookmarkStart w:id="74" w:name="praktiske-og-faglige-implikasjoner"/>
     <w:p>
       <w:pPr>
         <w:pStyle w:val="Heading3"/>
@@ -11063,7 +11481,7 @@
         <w:pStyle w:val="BodyText"/>
       </w:pPr>
       <w:r>
-        <w:t xml:space="preserve">Ekstern/ukjent bunkring må tolkes som et datagap, ikke som et nytt havnevalg. Når 46,89 % av forbruket faller i denne kategorien, betyr det at modellen er operasjonell, men at verdien for Odfjell øker betydelig dersom prisdata utvides til flere rutehavner og perioder. Dette er også tydelig på fartøynivå:</w:t>
+        <w:t xml:space="preserve">Ekstern/ukjent bunkring må tolkes som et datagap, ikke som et nytt havnevalg. Når 46,89 % av forbruket faller i denne kategorien og 60,91 % av modellkostnaden kommer fra proxykostnaden, betyr det at modellen først og fremst minimerer kostnaden ved den dekningen prisgrunnlaget tillater. Den dokumenterer ikke total optimalisering av hele drivstoffinnkjøpet. Dette er også tydelig på fartøynivå:</w:t>
       </w:r>
       <w:r>
         <w:t xml:space="preserve"> </w:t>
@@ -11193,19 +11611,42 @@
         <w:pStyle w:val="BodyText"/>
       </w:pPr>
       <w:r>
-        <w:t xml:space="preserve">Resultatene støtter teorigrunnlaget om lineær programmering som et egnet verktøy for kostnadsminimering under restriksjoner. Modellen finner ikke bare billigste historiske havn, men må balansere kostnad mot beholdning, kapasitet og etapperekkefølge. Dette er viktig fordi lav pris alene ikke gir en gjennomførbar beslutning dersom fartøyet ikke er i nærheten av den aktuelle havnen, eller dersom tankkapasiteten ikke tillater kjøpet. Funnene samsvarer også med bunkringslitteraturen, der refueling-beslutninger typisk forstås som en kombinasjon av pris, rute, kapasitet og usikkerhet (Besbes &amp; Savin, 2009; Wang &amp; Meng, 2015; Zhen et al., 2017). Rapporten skiller seg fra flere av disse bidragene ved å holde rute og hastighet faste, og heller bruke modellen til å dokumentere hva som faktisk kan optimeres med begrenset prisdekning.</w:t>
-      </w:r>
-    </w:p>
-    <w:p>
-      <w:pPr>
-        <w:pStyle w:val="BodyText"/>
-      </w:pPr>
-      <w:r>
-        <w:t xml:space="preserve">Teoretisk bidrar rapporten derfor ikke med en ny generell optimeringsmetode, men med en anvendt modellkobling mellom historiske transaksjonsdata og operasjonelle voyage-data. Anvendbarhetsklassifiseringen i klasse A, B og C fungerer som et metodisk tillegg fordi den gjør modellens gyldighetsområde eksplisitt. Policy-messig peker resultatene på at intern datastyring, prisdekning og standardisert registrering av bunkringsalternativer kan være like viktige som selve optimeringsalgoritmen dersom modellen skal brukes som beslutningsstøtte i større skala.</w:t>
-      </w:r>
-    </w:p>
-    <w:bookmarkEnd w:id="73"/>
-    <w:bookmarkStart w:id="74" w:name="begrensninger-og-videre-bruk"/>
+        <w:t xml:space="preserve">Resultatene støtter teorigrunnlaget om lineær programmering som et egnet verktøy for kostnadsminimering under restriksjoner. Modellen finner ikke bare billigste historiske havn, men må balansere kostnad mot beholdning, kapasitet og etapperekkefølge. Dette er viktig fordi lav pris alene ikke gir en gjennomførbar beslutning dersom fartøyet ikke er i nærheten av den aktuelle havnen, eller dersom tankkapasiteten ikke tillater kjøpet. Funnene samsvarer med bunkringslitteraturen ved at refueling-beslutningen behandles som en kombinasjon av pris, rute, kapasitet og forbruk (Besbes &amp; Savin, 2009; Sheng et al., 2015; Wang &amp; Meng, 2015; Zhen et al., 2017). Rapporten avviker samtidig fra flere av disse bidragene ved å holde rute og hastighet faste og ved å ikke modellere usikkerhet stokastisk. Det gjør modellen mindre generell, men mer transparent gitt datagrunnlaget som faktisk foreligger.</w:t>
+      </w:r>
+    </w:p>
+    <w:p>
+      <w:pPr>
+        <w:pStyle w:val="BodyText"/>
+      </w:pPr>
+      <w:r>
+        <w:t xml:space="preserve">Teoretisk bidrar rapporten derfor ikke med en ny generell optimeringsmetode, men med en anvendt modellkobling mellom historiske transaksjonsdata og operasjonelle voyage-data. Anvendbarhetsklassifiseringen i klasse A, B og C er det viktigste metodiske bidraget, fordi den gir et enkelt språk for å vurdere modellgyldighet på fartøynivå. Policy-messig peker resultatene på at intern datastyring, prisdekning og standardisert registrering av bunkringsalternativer kan være like viktige som selve optimeringsalgoritmen dersom modellen skal brukes som beslutningsstøtte i større skala.</w:t>
+      </w:r>
+    </w:p>
+    <w:p>
+      <w:pPr>
+        <w:pStyle w:val="BodyText"/>
+      </w:pPr>
+      <w:r>
+        <w:t xml:space="preserve">Noen funn var forventet, mens andre var mer overraskende. Det var forventet at modellen ville prioritere billigere prisede havner når rute og kapasitet tillot det. Det var mer uventet at</w:t>
+      </w:r>
+      <w:r>
+        <w:t xml:space="preserve"> </w:t>
+      </w:r>
+      <w:r>
+        <w:rPr>
+          <w:rStyle w:val="VerbatimChar"/>
+        </w:rPr>
+        <w:t xml:space="preserve">P002</w:t>
+      </w:r>
+      <w:r>
+        <w:t xml:space="preserve"> </w:t>
+      </w:r>
+      <w:r>
+        <w:t xml:space="preserve">ikke fikk modellert kjøp i basisscenarioet, at timing-overlappen mot observerte ROB-baserte bunkringshendelser var lav, og at kjøpsplanen var stabil selv når proxyprisen ble endret i sensitivitetsanalysen. Disse funnene understreker at modellen bør vurderes som et beslutningsstøtteverktøy med tydelige databegrensninger, ikke som en direkte kopi av operativ praksis.</w:t>
+      </w:r>
+    </w:p>
+    <w:bookmarkEnd w:id="74"/>
+    <w:bookmarkStart w:id="75" w:name="begrensninger-og-videre-bruk"/>
     <w:p>
       <w:pPr>
         <w:pStyle w:val="Heading3"/>
@@ -11240,7 +11681,7 @@
         <w:t xml:space="preserve">P004</w:t>
       </w:r>
       <w:r>
-        <w:t xml:space="preserve">, og havner utenfor dette settet får ikke egne prisestimater. Ekstern/ukjent bunkring er derfor kostnadsatt med en proxy, ikke observert som et faktisk innkjøpsalternativ. Sensitivitetsanalysen viser at total modellkostnad varierer med 5 190 071,68 mellom proxyfaktor 1,10 og 1,50, mens kjøpsplanen er stabil i de testede scenarioene. En lik prisendring på</w:t>
+        <w:t xml:space="preserve">, og havner utenfor dette settet får ikke egne prisestimater. Ekstern/ukjent bunkring er derfor kostnadsatt med en proxy, ikke observert som et faktisk innkjøpsalternativ. Proxyprisen er beregnet internt fra samme historiske havnegrunnlag som modellen bruker, og er ikke uavhengig forankret i spotmarkedsdata eller faktiske off-network-kjøp. Sensitivitetsanalysen viser at total modellkostnad varierer med 5 190 071,68 mellom proxyfaktor 1,10 og 1,50, mens kjøpsplanen er stabil i de testede scenarioene. En lik prisendring på</w:t>
       </w:r>
       <w:r>
         <w:t xml:space="preserve"> </w:t>
@@ -11286,9 +11727,9 @@
         </w:pict>
       </w:r>
     </w:p>
-    <w:bookmarkEnd w:id="74"/>
     <w:bookmarkEnd w:id="75"/>
-    <w:bookmarkStart w:id="76" w:name="konklusjon"/>
+    <w:bookmarkEnd w:id="76"/>
+    <w:bookmarkStart w:id="77" w:name="konklusjon"/>
     <w:p>
       <w:pPr>
         <w:pStyle w:val="Heading2"/>
@@ -11302,7 +11743,7 @@
         <w:pStyle w:val="FirstParagraph"/>
       </w:pPr>
       <w:r>
-        <w:t xml:space="preserve">Problemstillingen var hvordan en lineær optimaliseringsmodell kan bidra til å minimere drivstoffkostnader for Odfjell Tankers ved bruk av historiske prisdata og operative voyage-, forbruks- og beholdningsdata. Analysen viser at en slik modell kan gi konkret beslutningsstøtte når historiske prisdata kobles med rutesekvens, forbruk, startbeholdning og tankkapasitet.</w:t>
+        <w:t xml:space="preserve">Problemstillingen var i hvilken grad en deterministisk lineær kostnadsmodell, avgrenset til fire prisede modellhavner, én drivstoffkategori og åtte anonymiserte fartøyfiler, kan gi etterprøvbar beslutningsstøtte for fordeling av bunkring i Odfjell Tankers’ rutestruktur. Analysen viser at en slik modell kan gi konkret beslutningsstøtte når historiske prisdata kobles med rutesekvens, forbruk, startbeholdning og tankkapasitet.</w:t>
       </w:r>
     </w:p>
     <w:p>
@@ -11318,7 +11759,7 @@
         <w:pStyle w:val="BodyText"/>
       </w:pPr>
       <w:r>
-        <w:t xml:space="preserve">Det viktigste funnet er at modellen gir mest operativ verdi der fartøyenes ruter overlapper med prisgrunnlaget. Anvendbarhetsklassifiseringen viser at</w:t>
+        <w:t xml:space="preserve">Det praktiske bidraget er at modellen gir mest operativ verdi der fartøyenes ruter overlapper med prisgrunnlaget. Anvendbarhetsklassifiseringen viser at</w:t>
       </w:r>
       <w:r>
         <w:t xml:space="preserve"> </w:t>
@@ -11440,15 +11881,15 @@
         <w:pStyle w:val="BodyText"/>
       </w:pPr>
       <w:r>
-        <w:t xml:space="preserve">Sensitivitetsanalysen viser at total modellkostnad er følsom for proxykostnaden på ekstern/ukjent bunkring og for prisnivået i modellhavnene, men at kjøpsplanen er stabil i de testede scenarioene. Modellen kan derfor brukes som et transparent beslutningsgrunnlag på ruter med tilstrekkelig prisdekning, og som støtte for videre datainnsamling der ekstern/ukjent andel er høy. Full operativ anvendelse krever fortsatt bredere prisdekning, validering mot faktiske historiske bunkringsbeslutninger og faglig vurdering fra Odfjell Tankers.</w:t>
-      </w:r>
-    </w:p>
-    <w:p>
-      <w:pPr>
-        <w:pStyle w:val="BodyText"/>
-      </w:pPr>
-      <w:r>
-        <w:t xml:space="preserve">Rapportens metodiske bidrag er å vise hvordan historiske transaksjonsdata kan kobles til en operasjonell rute- og lagerbasert lineær modell under tydelige databegrensninger. Anvendbarhetsklassifiseringen gjør modellens gyldighetsområde eksplisitt ved å skille mellom ruter der modellen kan gi direkte beslutningsstøtte, og ruter der resultatet først og fremst dokumenterer et datagap.</w:t>
+        <w:t xml:space="preserve">Sammenligningen mot en naiv benchmark viser at LP-modellen gir 2 300 657,99 lavere modellkostnad enn en enkel fyll-til-kapasitet-regel innenfor samme datagrunnlag. Dette styrker modellens interne beslutningsverdi, men resultatet er ikke dokumentert besparelse mot faktisk Odfjell-praksis. Sensitivitetsanalysen viser at total modellkostnad er følsom for proxykostnaden på ekstern/ukjent bunkring og for prisnivået i modellhavnene, men at kjøpsplanen er stabil i de testede scenarioene. Modellen kan derfor brukes som et transparent beslutningsgrunnlag på ruter med tilstrekkelig prisdekning, og som støtte for videre datainnsamling der ekstern/ukjent andel er høy. Full operativ anvendelse krever fortsatt bredere prisdekning, validering mot faktiske historiske bunkringsbeslutninger og faglig vurdering fra Odfjell Tankers.</w:t>
+      </w:r>
+    </w:p>
+    <w:p>
+      <w:pPr>
+        <w:pStyle w:val="BodyText"/>
+      </w:pPr>
+      <w:r>
+        <w:t xml:space="preserve">Rapportens metodiske bidrag er å vise hvordan historiske transaksjonsdata kan kobles til en operasjonell rute- og lagerbasert lineær modell under tydelige databegrensninger. Anvendbarhetsklassifiseringen gjør modellens gyldighetsområde eksplisitt ved å skille mellom ruter der modellen kan gi direkte beslutningsstøtte, og ruter der resultatet først og fremst dokumenterer et datagap. Denne klassifiseringen kan også være relevant som metodisk grep i andre anvendte optimeringscaser der datadekningen varierer mellom objekter.</w:t>
       </w:r>
     </w:p>
     <w:p>
@@ -11474,8 +11915,8 @@
         </w:pict>
       </w:r>
     </w:p>
-    <w:bookmarkEnd w:id="76"/>
-    <w:bookmarkStart w:id="77" w:name="bibliografi"/>
+    <w:bookmarkEnd w:id="77"/>
+    <w:bookmarkStart w:id="78" w:name="bibliografi"/>
     <w:p>
       <w:pPr>
         <w:pStyle w:val="Heading2"/>
@@ -11538,19 +11979,7 @@
         <w:t xml:space="preserve">Everything You Need to Know About Marine Fuels</w:t>
       </w:r>
       <w:r>
-        <w:t xml:space="preserve">. (u.å.). PDF-dokument i</w:t>
-      </w:r>
-      <w:r>
-        <w:t xml:space="preserve"> </w:t>
-      </w:r>
-      <w:r>
-        <w:rPr>
-          <w:rStyle w:val="VerbatimChar"/>
-        </w:rPr>
-        <w:t xml:space="preserve">003 references/Everything You Need To Know About Marine Fuels.pdf</w:t>
-      </w:r>
-      <w:r>
-        <w:t xml:space="preserve">.</w:t>
+        <w:t xml:space="preserve">. (u.å.). PDF-vedlegg mottatt fra Odfjell Tankers. Se Vedlegg A.</w:t>
       </w:r>
     </w:p>
     <w:p>
@@ -11565,19 +11994,7 @@
         <w:t xml:space="preserve">FuelEU Guidance Document for Shipping Companies</w:t>
       </w:r>
       <w:r>
-        <w:t xml:space="preserve">. (2025, 8. oktober). PDF-dokument i</w:t>
-      </w:r>
-      <w:r>
-        <w:t xml:space="preserve"> </w:t>
-      </w:r>
-      <w:r>
-        <w:rPr>
-          <w:rStyle w:val="VerbatimChar"/>
-        </w:rPr>
-        <w:t xml:space="preserve">003 references/fueleu_guidance_document_for_shipping_companies_2025-10-08.pdf</w:t>
-      </w:r>
-      <w:r>
-        <w:t xml:space="preserve">.</w:t>
+        <w:t xml:space="preserve">. (2025, 8. oktober). PDF-vedlegg mottatt fra Odfjell Tankers. Se Vedlegg B.</w:t>
       </w:r>
     </w:p>
     <w:p>
@@ -11609,7 +12026,7 @@
         <w:pStyle w:val="BodyText"/>
       </w:pPr>
       <w:r>
-        <w:t xml:space="preserve">Grammenos, C. T. (Red.). (2026).</w:t>
+        <w:t xml:space="preserve">Grammenos, C. T. (2026).</w:t>
       </w:r>
       <w:r>
         <w:t xml:space="preserve"> </w:t>
@@ -11625,15 +12042,7 @@
         <w:t xml:space="preserve"> </w:t>
       </w:r>
       <w:r>
-        <w:t xml:space="preserve">(3. utg.). Informa Law from Routledge.</w:t>
-      </w:r>
-    </w:p>
-    <w:p>
-      <w:pPr>
-        <w:pStyle w:val="BodyText"/>
-      </w:pPr>
-      <w:r>
-        <w:t xml:space="preserve">Lov om opphavsrett til åndsverk mv. (åndsverkloven). (2018). LOV-2018-06-15-40. Lovdata. https://lovdata.no/LTI/lov/2018-06-15-40</w:t>
+        <w:t xml:space="preserve">(3. utg.). Routledge.</w:t>
       </w:r>
     </w:p>
     <w:p>
@@ -11799,8 +12208,8 @@
         </w:pict>
       </w:r>
     </w:p>
-    <w:bookmarkEnd w:id="77"/>
-    <w:bookmarkStart w:id="78" w:name="vedlegg"/>
+    <w:bookmarkEnd w:id="78"/>
+    <w:bookmarkStart w:id="79" w:name="vedlegg"/>
     <w:p>
       <w:pPr>
         <w:pStyle w:val="Heading2"/>
@@ -11825,15 +12234,16 @@
       </w:r>
       <w:r>
         <w:rPr>
-          <w:rStyle w:val="VerbatimChar"/>
-        </w:rPr>
-        <w:t xml:space="preserve">Everything You Need To Know About Marine Fuels.pdf</w:t>
-      </w:r>
-      <w:r>
-        <w:t xml:space="preserve"> </w:t>
-      </w:r>
-      <w:r>
-        <w:t xml:space="preserve">brukes som støttedokument for korte forklaringer av drivstofftypene</w:t>
+          <w:i/>
+          <w:iCs/>
+        </w:rPr>
+        <w:t xml:space="preserve">Everything You Need to Know About Marine Fuels</w:t>
+      </w:r>
+      <w:r>
+        <w:t xml:space="preserve"> </w:t>
+      </w:r>
+      <w:r>
+        <w:t xml:space="preserve">er et PDF-vedlegg mottatt fra Odfjell Tankers. Vedlegget brukes som støttedokument for korte forklaringer av drivstofftypene</w:t>
       </w:r>
       <w:r>
         <w:t xml:space="preserve"> </w:t>
@@ -11879,15 +12289,16 @@
       </w:r>
       <w:r>
         <w:rPr>
-          <w:rStyle w:val="VerbatimChar"/>
-        </w:rPr>
-        <w:t xml:space="preserve">fueleu_guidance_document_for_shipping_companies_2025-10-08.pdf</w:t>
-      </w:r>
-      <w:r>
-        <w:t xml:space="preserve"> </w:t>
-      </w:r>
-      <w:r>
-        <w:t xml:space="preserve">brukes som støttedokument for omtalen av regulatoriske rammer og hvorfor biodrivstoff også må forstås i lys av utslippskrav.</w:t>
+          <w:i/>
+          <w:iCs/>
+        </w:rPr>
+        <w:t xml:space="preserve">FuelEU Guidance Document for Shipping Companies</w:t>
+      </w:r>
+      <w:r>
+        <w:t xml:space="preserve"> </w:t>
+      </w:r>
+      <w:r>
+        <w:t xml:space="preserve">er et PDF-vedlegg mottatt fra Odfjell Tankers. Vedlegget brukes som støttedokument for omtalen av regulatoriske rammer og hvorfor biodrivstoff også må forstås i lys av utslippskrav.</w:t>
       </w:r>
     </w:p>
     <w:p>
@@ -12177,8 +12588,8 @@
         <w:t xml:space="preserve">Tabell C.1 Akronymer og forkortelser brukt i rapporten.</w:t>
       </w:r>
     </w:p>
-    <w:bookmarkEnd w:id="78"/>
     <w:bookmarkEnd w:id="79"/>
+    <w:bookmarkEnd w:id="80"/>
     <w:sectPr>
       <w:footnotePr>
         <w:numRestart w:val="eachSect"/>

</xml_diff>